<commit_message>
PD Lab III report: use the college's current Vision and Mission
Co-Authored-By: Claude Opus 5.5 <noreply@anthropic.com>
Claude-Session: https://claude.ai/code/session_01ArPBqxohDRqqJ7gwKwnp2n
</commit_message>
<xml_diff>
--- a/docs/NalamMesh_PD_Lab_III_Report.docx
+++ b/docs/NalamMesh_PD_Lab_III_Report.docx
@@ -1095,7 +1095,7 @@
         <w:jc w:val="both"/>
       </w:pPr>
       <w:r>
-        <w:t>To offer internationally recognized Computer Science and Engineering education driven by innovative research and nurture industry-ready, ethical professionals who contribute to sustainable national and global development.</w:t>
+        <w:t xml:space="preserve">To be a globally recognized technological Institution fostering excellence in academics, research and entrepreneurship, producing socially responsible engineers to meet evolving technological changes, leading to the sustainable development of the nation and the world.</w:t>
       </w:r>
     </w:p>
     <w:p>
@@ -1141,7 +1141,7 @@
           <w:sz w:val="28"/>
           <w:lang w:val="en-US"/>
         </w:rPr>
-        <w:t>To deliver outcome-based education adapting global standards and evolving industry requirements.</w:t>
+        <w:t xml:space="preserve">To impart quality technical education through Outcome-based learning and modern teaching practices.</w:t>
       </w:r>
     </w:p>
     <w:p>
@@ -1166,7 +1166,7 @@
           <w:sz w:val="28"/>
           <w:lang w:val="en-US"/>
         </w:rPr>
-        <w:t>To promote quality research, innovation, and problem-solving to address technological and societal challenges.</w:t>
+        <w:t xml:space="preserve">To promote research, innovation and entrepreneurship through strong industry interaction and incubation initiatives.</w:t>
       </w:r>
     </w:p>
     <w:p>
@@ -1191,7 +1191,7 @@
           <w:sz w:val="28"/>
           <w:lang w:val="en-US"/>
         </w:rPr>
-        <w:t>To nurture industry-ready professionals with ethical social responsibility and sustainability awareness.</w:t>
+        <w:t xml:space="preserve">To enhance employability and promote sustainability through continuous skill development and responsible social engagement.</w:t>
       </w:r>
     </w:p>
     <w:p>

</xml_diff>